<commit_message>
Deploiement du site : Prevoyance AXA, rubrique Prevoyance mutuelle retraite, nouveaux depliants
Co-Authored-By: Claude Sonnet 5.5 <noreply@anthropic.com>
Claude-Session: https://claude.ai/code/session_01Qy2Wa5ACXajAV16uhKD7cK
</commit_message>
<xml_diff>
--- a/resumes/att-cadres-2021.docx
+++ b/resumes/att-cadres-2021.docx
@@ -282,7 +282,21 @@
           <w:b w:val="0"/>
           <w:i w:val="0"/>
         </w:rPr>
-        <w:t xml:space="preserve"> : possible si vous êtes d'accord avec l'employeur (à condition de travailler à plus de 50%), en le demandant avant le 30 novembre, dans la limite de 5 jours par an pour un temps plein — avec une majoration de salaire d'au moins 25% (Article 1.5).</w:t>
+        <w:t xml:space="preserve"> : possible si vous êtes d'accord avec l'employeur (à condition de travailler à plus de 50%), en le demandant avant le 30 novembre, dans la limite de 5 jours par an pour un temps plein — avec une majoration de salaire d'au moins 25%. </w:t>
+      </w:r>
+      <w:r>
+        <w:rPr>
+          <w:b/>
+          <w:i w:val="0"/>
+        </w:rPr>
+        <w:t>Plafond à ne pas dépasser : 235 jours travaillés dans l'année</w:t>
+      </w:r>
+      <w:r>
+        <w:rPr>
+          <w:b w:val="0"/>
+          <w:i w:val="0"/>
+        </w:rPr>
+        <w:t xml:space="preserve"> si vous renoncez à des jours de repos (Article 1.5).</w:t>
       </w:r>
     </w:p>
     <w:p>
@@ -418,7 +432,7 @@
           <w:b w:val="0"/>
           <w:i w:val="0"/>
         </w:rPr>
-        <w:t xml:space="preserve"> : nécessite votre accord exprès (avenant au contrat) ; vos heures complémentaires sont majorées de 10% jusqu'à 1/10 de votre durée annuelle contractuelle, puis 25% au-delà, dans la limite d'1/3 de cette durée (Article 2.7).</w:t>
+        <w:t xml:space="preserve"> : nécessite votre accord exprès (avenant au contrat), pour une durée qui ne peut être inférieure à l'équivalent annuel de 24h/semaine ; vos heures complémentaires sont majorées de 10% jusqu'à 1/10 de votre durée annuelle contractuelle, puis 25% au-delà, dans la limite d'1/3 de cette durée. Vos interruptions d'activité dans la journée sont limitées à 2, chacune de 2h maximum, avec une période de travail continue d'au moins 3h (Article 2.7).</w:t>
       </w:r>
     </w:p>
     <w:p>
@@ -438,6 +452,25 @@
           <w:i w:val="0"/>
         </w:rPr>
         <w:t xml:space="preserve"> : 10h/jour, 46h/semaine en moyenne sur 12 semaines consécutives (Article 2.10).</w:t>
+      </w:r>
+    </w:p>
+    <w:p>
+      <w:pPr>
+        <w:pStyle w:val="ListBullet"/>
+      </w:pPr>
+      <w:r>
+        <w:rPr>
+          <w:b/>
+          <w:i w:val="0"/>
+        </w:rPr>
+        <w:t>Vos repos</w:t>
+      </w:r>
+      <w:r>
+        <w:rPr>
+          <w:b w:val="0"/>
+          <w:i w:val="0"/>
+        </w:rPr>
+        <w:t xml:space="preserve"> : 11h consécutives minimum entre deux journées de travail (Article 2.11) ; repos hebdomadaire de 48h consécutives (samedi et dimanche), sauf si vous êtes d'astreinte et devez intervenir — si vous travaillez le samedi matin à votre demande, vous pouvez déroger à ce repos de 48h, la demi-journée étant récupérée ultérieurement (Article 2.12).</w:t>
       </w:r>
     </w:p>
     <w:p>
@@ -526,6 +559,39 @@
           <w:i w:val="0"/>
         </w:rPr>
         <w:t xml:space="preserve"> : vos congés non pris sont reportés (Article 3.1.4, tel que modifié par l'avenant du 31/12/2025).</w:t>
+      </w:r>
+    </w:p>
+    <w:p>
+      <w:pPr>
+        <w:pStyle w:val="ListBullet"/>
+      </w:pPr>
+      <w:r>
+        <w:rPr>
+          <w:b/>
+          <w:i w:val="0"/>
+        </w:rPr>
+        <w:t>Si vous reprenez le travail après la fin de la période de prise des congés</w:t>
+      </w:r>
+      <w:r>
+        <w:rPr>
+          <w:b w:val="0"/>
+          <w:i w:val="0"/>
+        </w:rPr>
+        <w:t xml:space="preserve"> (suite à maternité, maladie, accident du travail ou maladie professionnelle) : vos congés non pris peuvent être reportés jusqu'à </w:t>
+      </w:r>
+      <w:r>
+        <w:rPr>
+          <w:b/>
+          <w:i w:val="0"/>
+        </w:rPr>
+        <w:t>fin janvier de l'année suivante</w:t>
+      </w:r>
+      <w:r>
+        <w:rPr>
+          <w:b w:val="0"/>
+          <w:i w:val="0"/>
+        </w:rPr>
+        <w:t xml:space="preserve"> ; si ce report n'est pas possible, ils sont placés sur votre CET (Article 3.1.5).</w:t>
       </w:r>
     </w:p>
     <w:p>
@@ -729,6 +795,186 @@
           <w:i w:val="0"/>
         </w:rPr>
         <w:t>Un seul changement depuis 2021 : l'avenant du 31/12/2025 a mis à jour la règle sur les congés payés pendant un arrêt maladie (voir ci-dessus) — tout le reste de l'accord reste identique. Pour les astreintes et le décès d'un proche pendant les congés, pensez aussi à vérifier les articles correspondants de la CCN des CLCC (respectivement 2.5.4.3 et 2.4.3.3).</w:t>
+      </w:r>
+    </w:p>
+    <w:p>
+      <w:pPr>
+        <w:pStyle w:val="Heading2"/>
+      </w:pPr>
+      <w:r>
+        <w:rPr>
+          <w:b w:val="0"/>
+          <w:i w:val="0"/>
+        </w:rPr>
+        <w:t>Suivi de l'accord</w:t>
+      </w:r>
+    </w:p>
+    <w:p>
+      <w:pPr>
+        <w:pStyle w:val="ListBullet"/>
+      </w:pPr>
+      <w:r>
+        <w:rPr>
+          <w:b/>
+          <w:i w:val="0"/>
+        </w:rPr>
+        <w:t>Commission de suivi</w:t>
+      </w:r>
+      <w:r>
+        <w:rPr>
+          <w:b w:val="0"/>
+          <w:i w:val="0"/>
+        </w:rPr>
+        <w:t xml:space="preserve"> : composée des délégués syndicaux, elle se réunit l'année suivant l'entrée en vigueur de l'accord (Article 4.1).</w:t>
+      </w:r>
+    </w:p>
+    <w:p>
+      <w:pPr>
+        <w:pStyle w:val="ListBullet"/>
+      </w:pPr>
+      <w:r>
+        <w:rPr>
+          <w:b/>
+          <w:i w:val="0"/>
+        </w:rPr>
+        <w:t>Bilan</w:t>
+      </w:r>
+      <w:r>
+        <w:rPr>
+          <w:b w:val="0"/>
+          <w:i w:val="0"/>
+        </w:rPr>
+        <w:t xml:space="preserve"> : un bilan quantitatif et qualitatif de l'application de l'accord est établi à cette occasion (Article 4.1) — l'accord ne précise pas devant quelle instance (CSE, CSEC...) ce bilan est présenté.</w:t>
+      </w:r>
+    </w:p>
+    <w:p>
+      <w:pPr>
+        <w:pStyle w:val="ListBullet"/>
+      </w:pPr>
+      <w:r>
+        <w:rPr>
+          <w:b/>
+          <w:i w:val="0"/>
+        </w:rPr>
+        <w:t>Suivi individuel du forfait jours</w:t>
+      </w:r>
+      <w:r>
+        <w:rPr>
+          <w:b w:val="0"/>
+          <w:i w:val="0"/>
+        </w:rPr>
+        <w:t xml:space="preserve"> : document de contrôle mensuel des jours travaillés/de repos et des alertes sur le respect des repos, transmis au service RH (Article 1.3, numéroté « 1.1.3 » dans le texte) ; dispositif d'alerte automatique vers le N+1 en cas de non-remise du document ou de non-respect des repos plus de 5 fois dans le mois, avec entretien sous 30 jours (Article 1.3, numéroté « 1.1.4 ») ; entretien annuel dédié (Article 1.3, numéroté « 1.1.5 »).</w:t>
+      </w:r>
+    </w:p>
+    <w:p>
+      <w:pPr>
+        <w:pStyle w:val="ListBullet"/>
+      </w:pPr>
+      <w:r>
+        <w:rPr>
+          <w:b/>
+          <w:i w:val="0"/>
+        </w:rPr>
+        <w:t>Durée de l'accord</w:t>
+      </w:r>
+      <w:r>
+        <w:rPr>
+          <w:b w:val="0"/>
+          <w:i w:val="0"/>
+        </w:rPr>
+        <w:t xml:space="preserve"> : durée indéterminée ; entrée en vigueur le premier jour du mois suivant son dépôt (Article 4.2).</w:t>
+      </w:r>
+    </w:p>
+    <w:p>
+      <w:pPr>
+        <w:pStyle w:val="ListBullet"/>
+      </w:pPr>
+      <w:r>
+        <w:rPr>
+          <w:b/>
+          <w:i w:val="0"/>
+        </w:rPr>
+        <w:t>Révision</w:t>
+      </w:r>
+      <w:r>
+        <w:rPr>
+          <w:b w:val="0"/>
+          <w:i w:val="0"/>
+        </w:rPr>
+        <w:t xml:space="preserve"> : procédure renvoyant à l'article L. 2261-7-1 du Code du travail (Article 4.3).</w:t>
+      </w:r>
+    </w:p>
+    <w:p>
+      <w:pPr>
+        <w:pStyle w:val="ListBullet"/>
+      </w:pPr>
+      <w:r>
+        <w:rPr>
+          <w:b/>
+          <w:i w:val="0"/>
+        </w:rPr>
+        <w:t>Dénonciation</w:t>
+      </w:r>
+      <w:r>
+        <w:rPr>
+          <w:b w:val="0"/>
+          <w:i w:val="0"/>
+        </w:rPr>
+        <w:t xml:space="preserve"> : possible à tout moment par lettre recommandée avec accusé de réception ; l'accord cesse en principe de s'appliquer au dernier jour des mandats des membres du CSE ; déclaration à déposer auprès de l'Unité Territoriale de Maine-et-Loire de la DIRECCTE d'Angers (Article 4.4).</w:t>
+      </w:r>
+    </w:p>
+    <w:p>
+      <w:pPr>
+        <w:pStyle w:val="ListBullet"/>
+      </w:pPr>
+      <w:r>
+        <w:rPr>
+          <w:b/>
+          <w:i w:val="0"/>
+        </w:rPr>
+        <w:t>Avenant du 31/12/2025 (congés payés pendant un arrêt maladie)</w:t>
+      </w:r>
+      <w:r>
+        <w:rPr>
+          <w:b w:val="0"/>
+          <w:i w:val="0"/>
+        </w:rPr>
+        <w:t xml:space="preserve"> : pas de commission de suivi propre à l'avenant ; durée indéterminée, entrée en vigueur dès la signature (Article 2.1 de l'avenant) ; révision (Article 2.2 de l'avenant) et dénonciation (Article 2.3 de l'avenant, dépôt auprès de la DREETS d'Angers) selon les mêmes mécanismes que l'accord de 2021.</w:t>
+      </w:r>
+    </w:p>
+    <w:p>
+      <w:r>
+        <w:rPr>
+          <w:color w:val="5B6578"/>
+          <w:sz w:val="16"/>
+        </w:rPr>
+        <w:t>────────────────────────────────────────</w:t>
+      </w:r>
+    </w:p>
+    <w:p>
+      <w:r>
+        <w:rPr>
+          <w:b w:val="0"/>
+          <w:i/>
+          <w:color w:val="5B6578"/>
+        </w:rPr>
+        <w:t xml:space="preserve">Les références entre parenthèses renvoient aux articles de l'accord ou de l'avenant. Seul le texte intégral fait référence : </w:t>
+      </w:r>
+      <w:r>
+        <w:rPr>
+          <w:b w:val="0"/>
+          <w:i/>
+          <w:color w:val="5B6578"/>
+        </w:rPr>
+        <w:t>accord complet (PDF)</w:t>
+      </w:r>
+      <w:r>
+        <w:rPr>
+          <w:b w:val="0"/>
+          <w:i/>
+          <w:color w:val="5B6578"/>
+        </w:rPr>
+        <w:t>.</w:t>
       </w:r>
     </w:p>
     <w:sectPr>

</xml_diff>

<commit_message>
Résumés mis à jour (bandeau, commentaires retirés)
Co-Authored-By: Claude Sonnet 5.5 <noreply@anthropic.com>
Claude-Session: https://claude.ai/code/session_014ZH9uJbiB7eJrQsuh3THLD
</commit_message>
<xml_diff>
--- a/resumes/att-cadres-2021.docx
+++ b/resumes/att-cadres-2021.docx
@@ -46,7 +46,7 @@
           <w:b/>
           <w:i w:val="0"/>
         </w:rPr>
-        <w:t>Source : accord du 12 mai 2021, tel que modifié par l'avenant du 31 décembre 2025 (article 3.1.4 sur les congés payés pendant un arrêt maladie, seul point modifié — le reste de l'accord de 2021 est inchangé).</w:t>
+        <w:t>Source : accord du 12 mai 2021, tel que modifié par l'avenant du 31 décembre 2025 (article 3.1.4 sur les congés payés pendant un arrêt maladie).</w:t>
       </w:r>
     </w:p>
     <w:p>
@@ -603,7 +603,7 @@
           <w:b/>
           <w:i w:val="0"/>
         </w:rPr>
-        <w:t>Et si vous tombez malade pendant vos congés (règle en vigueur depuis le 31/12/2025)</w:t>
+        <w:t>Et si vous tombez malade pendant vos congés</w:t>
       </w:r>
       <w:r>
         <w:rPr>
@@ -638,22 +638,7 @@
           <w:b w:val="0"/>
           <w:i w:val="0"/>
         </w:rPr>
-        <w:t xml:space="preserve">. </w:t>
-      </w:r>
-      <w:r>
-        <w:rPr>
-          <w:b w:val="0"/>
-          <w:i/>
-          <w:color w:val="5B6578"/>
-        </w:rPr>
-        <w:t>(C'est un changement par rapport à la règle de 2021, qui prévoyait un maintien du congé sans interruption — la mise à jour aligne l'accord sur le droit applicable.)</w:t>
-      </w:r>
-      <w:r>
-        <w:rPr>
-          <w:b w:val="0"/>
-          <w:i w:val="0"/>
-        </w:rPr>
-        <w:t xml:space="preserve"> À votre retour d'arrêt maladie, vous êtes informé du report de vos droits (bulletin de salaire ou mail), et vous avez </w:t>
+        <w:t xml:space="preserve">. À votre retour d'arrêt maladie, vous êtes informé du report de vos droits (bulletin de salaire ou mail), et vous avez </w:t>
       </w:r>
       <w:r>
         <w:rPr>
@@ -844,7 +829,7 @@
           <w:b w:val="0"/>
           <w:i w:val="0"/>
         </w:rPr>
-        <w:t xml:space="preserve"> : un bilan quantitatif et qualitatif de l'application de l'accord est établi à cette occasion (Article 4.1) — l'accord ne précise pas devant quelle instance (CSE, CSEC...) ce bilan est présenté.</w:t>
+        <w:t xml:space="preserve"> : un bilan quantitatif et qualitatif de l'application de l'accord est établi à cette occasion (Article 4.1).</w:t>
       </w:r>
     </w:p>
     <w:p>
@@ -863,7 +848,7 @@
           <w:b w:val="0"/>
           <w:i w:val="0"/>
         </w:rPr>
-        <w:t xml:space="preserve"> : document de contrôle mensuel des jours travaillés/de repos et des alertes sur le respect des repos, transmis au service RH (Article 1.3, numéroté « 1.1.3 » dans le texte) ; dispositif d'alerte automatique vers le N+1 en cas de non-remise du document ou de non-respect des repos plus de 5 fois dans le mois, avec entretien sous 30 jours (Article 1.3, numéroté « 1.1.4 ») ; entretien annuel dédié (Article 1.3, numéroté « 1.1.5 »).</w:t>
+        <w:t xml:space="preserve"> : document de contrôle mensuel des jours travaillés/de repos et des alertes sur le respect des repos, transmis au service RH (Article 1.3) ; dispositif d'alerte automatique vers le N+1 en cas de non-remise du document ou de non-respect des repos plus de 5 fois dans le mois, avec entretien sous 30 jours (Article 1.3) ; entretien annuel dédié (Article 1.3).</w:t>
       </w:r>
     </w:p>
     <w:p>

</xml_diff>